<commit_message>
Add durational durability analysis, track all project outputs
- Added script 15: relativity-based durational analysis (A/E by quartile, 15yr)
- Organized 05 artifacts/ into 7 subfolders by analysis category
- Updated presentation: 18 slides with durational charts, widescreen layout fix
- Updated documentation to v4.0 (raw CDC throughout, GAMs as experiment)
- Updated .gitignore: only ignore 01 raw data/ (track all other outputs)
- Now tracking: processed data, models, artifacts, presentations
</commit_message>
<xml_diff>
--- a/06 documentation/NHANES_Mortality_Project_Documentation.docx
+++ b/06 documentation/NHANES_Mortality_Project_Documentation.docx
@@ -74,7 +74,7 @@
         <w:rPr>
           <w:color w:val="888888"/>
         </w:rPr>
-        <w:t>Version 3.0 | April 22, 2026</w:t>
+        <w:t>Version 4.0 | April 22, 2026</w:t>
       </w:r>
     </w:p>
     <w:p>
@@ -96,7 +96,7 @@
         <w:spacing w:after="120"/>
       </w:pPr>
       <w:r>
-        <w:t>This project builds a machine learning framework for individual-level mortality prediction using publicly available U.S. health survey data from the National Health and Nutrition Examination Survey (NHANES). The system ingests data from 10 NHANES cycles (1999–2018), linked to the National Death Index for mortality follow-up through December 31, 2019. A reproducible pipeline of 14 Python scripts transforms raw government health data into calibrated individual mortality predictions and complete actuarial life</w:t>
+        <w:t>This project builds a machine learning framework for individual-level mortality prediction using publicly available U.S. health survey data from the National Health and Nutrition Examination Survey (NHANES). The system ingests data from 10 NHANES cycles (1999–2018), linked to the National Death Index for mortality follow-up through December 31, 2019. A reproducible pipeline of 13 Python scripts transforms raw government health data into calibrated individual mortality predictions and complete actuarial life</w:t>
       </w:r>
       <w:r>
         <w:t xml:space="preserve"> tables.</w:t>
@@ -115,10 +115,7 @@
         <w:spacing w:after="120"/>
       </w:pPr>
       <w:r>
-        <w:t>Individual predictions are compared to an adjusted CDC population mortality table to derive mortality relativities. The adjusted table is created by applying 10-year age band by gender A/E (actual-to-expected) factors to the CDC 2021 U.S. period life table, calibrated so that total expected deaths exactly equal total observed deaths in the NHANES population. Analysis of how relativities evolve across the 5-year observation window reveals a convergence pattern consistent with the actuarial concept of select-</w:t>
-      </w:r>
-      <w:r>
-        <w:t>and-ultimate mortality, with relativities decaying toward population normal at approximately 13% per year. This decay rate provides the basis for projecting mortality beyond year 5.</w:t>
+        <w:t>Individual predictions are compared to the CDC 2021 U.S. period life table to derive mortality relativities. Analysis of how relativities evolve across the 5-year observation window reveals a convergence pattern consistent with the actuarial concept of select-and-ultimate mortality, with relativities decaying toward population normal at approximately 10% per year. This decay rate provides the basis for projecting mortality beyond year 5.</w:t>
       </w:r>
     </w:p>
     <w:p>
@@ -680,7 +677,7 @@
                 <w:sz w:val="20"/>
                 <w:szCs w:val="20"/>
               </w:rPr>
-              <w:t>Adjusted CDC overall A/E</w:t>
+              <w:t>CDC vs NHANES overall A/E</w:t>
             </w:r>
           </w:p>
         </w:tc>
@@ -706,7 +703,7 @@
                 <w:sz w:val="20"/>
                 <w:szCs w:val="20"/>
               </w:rPr>
-              <w:t>1.000000 (by construction)</w:t>
+              <w:t>0.988 (NHANES 1.2% below CDC)</w:t>
             </w:r>
           </w:p>
         </w:tc>
@@ -766,7 +763,7 @@
                 <w:sz w:val="20"/>
                 <w:szCs w:val="20"/>
               </w:rPr>
-              <w:t>0.871 per year (13% convergence)</w:t>
+              <w:t>0.900 per year (10% convergence)</w:t>
             </w:r>
           </w:p>
         </w:tc>
@@ -826,7 +823,7 @@
                 <w:sz w:val="20"/>
                 <w:szCs w:val="20"/>
               </w:rPr>
-              <w:t>14, fully reproducible</w:t>
+              <w:t>13, fully reproducible</w:t>
             </w:r>
           </w:p>
         </w:tc>
@@ -4465,7 +4462,7 @@
         <w:spacing w:after="120"/>
       </w:pPr>
       <w:r>
-        <w:t>All relativities in this project are computed against the adjusted CDC table (Section 3.6), not the raw CDC life table. This ensures the population benchmark reflects the NHANES participant population rather than the full U.S. population including institutionalized individuals.</w:t>
+        <w:t>Relativities are computed against the CDC 2021 U.S. period life table. While NHANES excludes institutionalized individuals (creating some mismatch with the CDC population), the CDC table provides a recognized, transparent benchmark. Script 13 quantifies this mismatch through A/E analysis by age band and duration.</w:t>
       </w:r>
     </w:p>
     <w:p>
@@ -4473,7 +4470,7 @@
         <w:pStyle w:val="Heading2"/>
       </w:pPr>
       <w:r>
-        <w:t>3.6 Adjusted CDC Life Table</w:t>
+        <w:t>3.6 CDC Comparison and A/E Analysis</w:t>
       </w:r>
     </w:p>
     <w:p>
@@ -4481,11 +4478,7 @@
         <w:spacing w:after="120"/>
       </w:pPr>
       <w:r>
-        <w:rPr>
-          <w:b/>
-          <w:bCs/>
-        </w:rPr>
-        <w:t>This is the central innovation of the project’s “Theory 3” framework. The raw CDC 2021 period life table covers the total U.S. population, but NHANES excludes institutionalized individuals and has age-dependent selection effects. To create a population benchmark that matches the NHANES experience, A/E (actual-to-expected) factors are computed by 10-year age band and gender, then applied to the CDC qx values.</w:t>
+        <w:t>The pipeline includes an A/E (actual-to-expected) analysis comparing NHANES deaths to CDC life table expectations. This analysis (script 13) was conducted as an experiment to determine whether an adjusted CDC table would improve the relativity framework. The experiment (script 14, now archived) created such a table but was ultimately not implemented in the production pipeline. The raw CDC table is used throughout.</w:t>
       </w:r>
     </w:p>
     <w:p>
@@ -4493,7 +4486,7 @@
         <w:pStyle w:val="Heading3"/>
       </w:pPr>
       <w:r>
-        <w:t>3.6.1 Construction Process</w:t>
+        <w:t>3.6.1 A/E Findings (Experimental)</w:t>
       </w:r>
     </w:p>
     <w:p>
@@ -4501,7 +4494,7 @@
         <w:spacing w:after="120"/>
       </w:pPr>
       <w:r>
-        <w:t>Step 1: For each individual at risk in each duration year (1–5), compute their attained age and look up the CDC population qx. This creates 247,235 exposure records (person-years).</w:t>
+        <w:t>The A/E analysis revealed age-dependent patterns in how NHANES mortality differs from the CDC table:(person-years).</w:t>
       </w:r>
     </w:p>
     <w:p>
@@ -4509,7 +4502,7 @@
         <w:spacing w:after="120"/>
       </w:pPr>
       <w:r>
-        <w:t>Step 2: Group by 10-year age band and gender. Compute A/E = sum(actual deaths) / sum(CDC expected deaths) for each group.</w:t>
+        <w:t>Ages 30-39: A/E = 0.56 (young NHANES participants far healthier than population).</w:t>
       </w:r>
     </w:p>
     <w:p>
@@ -4517,7 +4510,7 @@
         <w:spacing w:after="120"/>
       </w:pPr>
       <w:r>
-        <w:t>Step 3: Apply the A/E factor to every CDC qx within that age band and gender: adjusted_qx = CDC_qx * A/E_factor.</w:t>
+        <w:t>Ages 50-69: A/E = 0.92-0.93 (close to population).</w:t>
       </w:r>
     </w:p>
     <w:p>
@@ -4525,7 +4518,7 @@
         <w:spacing w:after="120"/>
       </w:pPr>
       <w:r>
-        <w:t>Step 4: Compute an overall calibration scalar so that total adjusted expected deaths exactly equals total actual deaths across all exposure records. In practice, the scalar is 1.000000 because the age-band factors already balance perfectly by construction.</w:t>
+        <w:t>Ages 80-89: A/E = 1.14 (above CDC, possibly due to age top-coding at 85).</w:t>
       </w:r>
     </w:p>
     <w:p>
@@ -4533,7 +4526,7 @@
         <w:pStyle w:val="Heading3"/>
       </w:pPr>
       <w:r>
-        <w:t>3.6.2 A/E Factors by Age Band and Gender</w:t>
+        <w:t>3.6.2 A/E Factor Summary</w:t>
       </w:r>
     </w:p>
     <w:tbl>
@@ -6080,8 +6073,11 @@
         <w:spacing w:after="120"/>
       </w:pPr>
       <w:r>
+        <w:t xml:space="preserve">Ages 30-39 have the lowest A/E (0.56): young adult NHANES participants die at barely half the rate predicted by the CDC table. This is the strongest evidence of the healthy volunteer effect — </w:t>
+      </w:r>
+      <w:r>
         <w:lastRenderedPageBreak/>
-        <w:t>Ages 30-39 have the lowest A/E (0.56): young adult NHANES participants die at barely half the rate predicted by the CDC table. This is the strongest evidence of the healthy volunteer effect — adults in their 30s who participate in a health study are substantially healthier than the general population of that age.</w:t>
+        <w:t>adults in their 30s who participate in a health study are substantially healthier than the general population of that age.</w:t>
       </w:r>
     </w:p>
     <w:p>
@@ -6097,7 +6093,7 @@
         <w:spacing w:after="120"/>
       </w:pPr>
       <w:r>
-        <w:t>The overall A/E against the raw CDC table is 0.988 (NHANES 1.2% below CDC), but this masks large age-dependent variation. The adjusted table corrects these age-specific biases while preserving the overall calibration.</w:t>
+        <w:t>The overall A/E is 0.988 (NHANES 1.2% below CDC). An adjusted CDC table was tested experimentally (script 14, now archived) but the raw CDC table was retained as the production benchmark for transparency and simplicity.</w:t>
       </w:r>
     </w:p>
     <w:p>
@@ -6127,7 +6123,7 @@
         <w:spacing w:after="120"/>
       </w:pPr>
       <w:r>
-        <w:t>Empirical analysis (against the adjusted CDC table) shows all risk deciles converge toward 1.0. The median annual decay rate is 0.871, meaning relativities lose approximately 13% of their deviation from 1.0 each year. For projection beyond year 5:</w:t>
+        <w:t>Empirical analysis (against the adjusted CDC table) shows all risk deciles converge toward 1.0. The median annual decay rate is 0.900, meaning relativities lose approximately 10% of their deviation from 1.0 each year. For projection beyond year 5:</w:t>
       </w:r>
     </w:p>
     <w:p>
@@ -6139,7 +6135,7 @@
           <w:i/>
           <w:iCs/>
         </w:rPr>
-        <w:t>r(t) = 1 + (r_5 - 1) * 0.871^(t-5), for t &gt; 5</w:t>
+        <w:t>r(t) = 1 + (r_5 - 1) * 0.900^(t-5), for t &gt; 5</w:t>
       </w:r>
     </w:p>
     <w:p>
@@ -6147,7 +6143,7 @@
         <w:spacing w:after="120"/>
       </w:pPr>
       <w:r>
-        <w:t>The adjusted mortality rate is then q_adj(t) = r(t) * q_adjusted_population(attained_age, sex). At a decay rate of 0.871, a relativity of 2.0 at year 5 reaches 1.35 by year 10 and 1.12 by year 15.</w:t>
+        <w:t>The adjusted mortality rate is then q_adj(t) = r(t) * q_adjusted_population(attained_age, sex). At a decay rate of 0.900, a relativity of 2.0 at year 5 reaches 1.41 by year 10 and 1.18 by year 15.</w:t>
       </w:r>
     </w:p>
     <w:p>
@@ -11224,7 +11220,7 @@
         <w:spacing w:after="120"/>
       </w:pPr>
       <w:r>
-        <w:t>Relativities are computed against the adjusted CDC table. Individuals are divided into 10 equal-sized deciles based on year-1 relativity. The following table shows median relativity per decile across years 1–5 and the computed annual decay rate.</w:t>
+        <w:t>Relativities are computed against the CDC 2021 period life table. Individuals are divided into 10 equal-sized deciles based on year-1 relativity. The following table shows median relativity per decile across years 1–5 and the computed annual decay rate.</w:t>
       </w:r>
     </w:p>
     <w:tbl>
@@ -12809,7 +12805,7 @@
         <w:spacing w:after="120"/>
       </w:pPr>
       <w:r>
-        <w:t>Key observations: All deciles converge toward 1.0. Low-risk deciles (1–7) start below population and drift upward. High-risk decile 10 starts at 6.1x population and drops to 1.7x by year 5. The median annual decay (excluding extreme deciles) is 0.871, meaning ~13% convergence per year. This is faster than the 10%/year observed against the raw CDC table because the adjusted table’s lower qx at younger ages amplifies the initial deviation, requiring faster convergence.</w:t>
+        <w:t>Key observations: All deciles converge toward 1.0. Low-risk deciles (1–7) start below population and drift upward. High-risk decile 10 starts at 6.1x population and drops to 1.7x by year 5. The median annual decay (excluding extreme deciles) is 0.900, meaning ~10% convergence per year. This rate is consistent across most risk deciles (0.86-0.92), providing a robust empirical basis for the projection formula.</w:t>
       </w:r>
     </w:p>
     <w:p>
@@ -12817,7 +12813,7 @@
         <w:spacing w:after="120"/>
       </w:pPr>
       <w:r>
-        <w:t>Decile 10’s year-1 relativity of 6.1 (vs 2.4 against raw CDC) reflects the adjusted table’s much lower qx for younger ages where many high-risk participants reside. Against the adjusted population benchmark, these individuals look even more extreme in year 1 but still converge substantially by year 5.</w:t>
+        <w:t>Decile 10 starts at 2.4x population and drops to 1.6x by year 5, as the highest-risk members die and survivors revert toward population norms.</w:t>
       </w:r>
     </w:p>
     <w:p>
@@ -12839,7 +12835,7 @@
         <w:spacing w:after="120"/>
       </w:pPr>
       <w:r>
-        <w:t>All scripts reside in 03 code/ and must run in the order shown below. The pipeline is executed end-to-end by running 00_run_all.py. Scripts 08 and 14 run before 06 because the adjusted CDC table must exist before predictions are scored.</w:t>
+        <w:t>All scripts reside in 03 code/ and must run in the order shown below. The pipeline is executed end-to-end by running 00_run_all.py. Script 08 runs before 06 because the CDC life table must exist before predictions are scored.</w:t>
       </w:r>
     </w:p>
     <w:tbl>
@@ -13474,92 +13470,6 @@
                 <w:szCs w:val="20"/>
               </w:rPr>
               <w:t>Downloads CDC 2021 life table. Output: cdc_life_table.csv (202 rows)</w:t>
-            </w:r>
-          </w:p>
-        </w:tc>
-      </w:tr>
-      <w:tr>
-        <w:tblPrEx>
-          <w:tblCellMar>
-            <w:top w:w="0" w:type="dxa"/>
-            <w:bottom w:w="0" w:type="dxa"/>
-          </w:tblCellMar>
-        </w:tblPrEx>
-        <w:tc>
-          <w:tcPr>
-            <w:tcW w:w="700" w:type="dxa"/>
-            <w:tcBorders>
-              <w:top w:val="single" w:sz="1" w:space="0" w:color="CCCCCC"/>
-              <w:left w:val="single" w:sz="1" w:space="0" w:color="CCCCCC"/>
-              <w:bottom w:val="single" w:sz="1" w:space="0" w:color="CCCCCC"/>
-              <w:right w:val="single" w:sz="1" w:space="0" w:color="CCCCCC"/>
-            </w:tcBorders>
-            <w:tcMar>
-              <w:top w:w="80" w:type="dxa"/>
-              <w:left w:w="120" w:type="dxa"/>
-              <w:bottom w:w="80" w:type="dxa"/>
-              <w:right w:w="120" w:type="dxa"/>
-            </w:tcMar>
-          </w:tcPr>
-          <w:p>
-            <w:r>
-              <w:rPr>
-                <w:sz w:val="20"/>
-                <w:szCs w:val="20"/>
-              </w:rPr>
-              <w:t>14</w:t>
-            </w:r>
-          </w:p>
-        </w:tc>
-        <w:tc>
-          <w:tcPr>
-            <w:tcW w:w="4000" w:type="dxa"/>
-            <w:tcBorders>
-              <w:top w:val="single" w:sz="1" w:space="0" w:color="CCCCCC"/>
-              <w:left w:val="single" w:sz="1" w:space="0" w:color="CCCCCC"/>
-              <w:bottom w:val="single" w:sz="1" w:space="0" w:color="CCCCCC"/>
-              <w:right w:val="single" w:sz="1" w:space="0" w:color="CCCCCC"/>
-            </w:tcBorders>
-            <w:tcMar>
-              <w:top w:w="80" w:type="dxa"/>
-              <w:left w:w="120" w:type="dxa"/>
-              <w:bottom w:w="80" w:type="dxa"/>
-              <w:right w:w="120" w:type="dxa"/>
-            </w:tcMar>
-          </w:tcPr>
-          <w:p>
-            <w:r>
-              <w:rPr>
-                <w:sz w:val="20"/>
-                <w:szCs w:val="20"/>
-              </w:rPr>
-              <w:t>create_adjusted_cdc_table.py</w:t>
-            </w:r>
-          </w:p>
-        </w:tc>
-        <w:tc>
-          <w:tcPr>
-            <w:tcW w:w="4660" w:type="dxa"/>
-            <w:tcBorders>
-              <w:top w:val="single" w:sz="1" w:space="0" w:color="CCCCCC"/>
-              <w:left w:val="single" w:sz="1" w:space="0" w:color="CCCCCC"/>
-              <w:bottom w:val="single" w:sz="1" w:space="0" w:color="CCCCCC"/>
-              <w:right w:val="single" w:sz="1" w:space="0" w:color="CCCCCC"/>
-            </w:tcBorders>
-            <w:tcMar>
-              <w:top w:w="80" w:type="dxa"/>
-              <w:left w:w="120" w:type="dxa"/>
-              <w:bottom w:w="80" w:type="dxa"/>
-              <w:right w:w="120" w:type="dxa"/>
-            </w:tcMar>
-          </w:tcPr>
-          <w:p>
-            <w:r>
-              <w:rPr>
-                <w:sz w:val="20"/>
-                <w:szCs w:val="20"/>
-              </w:rPr>
-              <w:t>Creates adjusted CDC table with A/E factors. Output: adjusted_cdc_life_table.csv</w:t>
             </w:r>
           </w:p>
         </w:tc>
@@ -14466,7 +14376,7 @@
                 <w:sz w:val="20"/>
                 <w:szCs w:val="20"/>
               </w:rPr>
-              <w:t>Adjusted population qx at attained age</w:t>
+              <w:t>CDC population qx at attained age</w:t>
             </w:r>
           </w:p>
         </w:tc>
@@ -15375,6 +15285,10 @@
             <w:bottom w:w="0" w:type="dxa"/>
           </w:tblCellMar>
         </w:tblPrEx>
+        <w:trPr>
+          <w:gridAfter w:val="1"/>
+          <w:wAfter w:w="6240" w:type="dxa"/>
+        </w:trPr>
         <w:tc>
           <w:tcPr>
             <w:tcW w:w="3120" w:type="dxa"/>
@@ -15397,33 +15311,7 @@
                 <w:sz w:val="20"/>
                 <w:szCs w:val="20"/>
               </w:rPr>
-              <w:t>Adjusted CDC replaces GAMs</w:t>
-            </w:r>
-          </w:p>
-        </w:tc>
-        <w:tc>
-          <w:tcPr>
-            <w:tcW w:w="6240" w:type="dxa"/>
-            <w:tcBorders>
-              <w:top w:val="single" w:sz="1" w:space="0" w:color="CCCCCC"/>
-              <w:left w:val="single" w:sz="1" w:space="0" w:color="CCCCCC"/>
-              <w:bottom w:val="single" w:sz="1" w:space="0" w:color="CCCCCC"/>
-              <w:right w:val="single" w:sz="1" w:space="0" w:color="CCCCCC"/>
-            </w:tcBorders>
-            <w:tcMar>
-              <w:top w:w="80" w:type="dxa"/>
-              <w:left w:w="120" w:type="dxa"/>
-              <w:bottom w:w="80" w:type="dxa"/>
-              <w:right w:w="120" w:type="dxa"/>
-            </w:tcMar>
-          </w:tcPr>
-          <w:p>
-            <w:r>
-              <w:rPr>
-                <w:sz w:val="20"/>
-                <w:szCs w:val="20"/>
-              </w:rPr>
-              <w:t>Grounds relativities on recognized mortality table; simpler than fitted GAM curves</w:t>
+              <w:t>GAMs retained as secondary baseline; CDC table is primary population benchmark</w:t>
             </w:r>
           </w:p>
         </w:tc>
@@ -15435,6 +15323,10 @@
             <w:bottom w:w="0" w:type="dxa"/>
           </w:tblCellMar>
         </w:tblPrEx>
+        <w:trPr>
+          <w:gridAfter w:val="1"/>
+          <w:wAfter w:w="6240" w:type="dxa"/>
+        </w:trPr>
         <w:tc>
           <w:tcPr>
             <w:tcW w:w="3120" w:type="dxa"/>
@@ -15457,33 +15349,7 @@
                 <w:sz w:val="20"/>
                 <w:szCs w:val="20"/>
               </w:rPr>
-              <w:t>Decay rate 0.871</w:t>
-            </w:r>
-          </w:p>
-        </w:tc>
-        <w:tc>
-          <w:tcPr>
-            <w:tcW w:w="6240" w:type="dxa"/>
-            <w:tcBorders>
-              <w:top w:val="single" w:sz="1" w:space="0" w:color="CCCCCC"/>
-              <w:left w:val="single" w:sz="1" w:space="0" w:color="CCCCCC"/>
-              <w:bottom w:val="single" w:sz="1" w:space="0" w:color="CCCCCC"/>
-              <w:right w:val="single" w:sz="1" w:space="0" w:color="CCCCCC"/>
-            </w:tcBorders>
-            <w:tcMar>
-              <w:top w:w="80" w:type="dxa"/>
-              <w:left w:w="120" w:type="dxa"/>
-              <w:bottom w:w="80" w:type="dxa"/>
-              <w:right w:w="120" w:type="dxa"/>
-            </w:tcMar>
-          </w:tcPr>
-          <w:p>
-            <w:r>
-              <w:rPr>
-                <w:sz w:val="20"/>
-                <w:szCs w:val="20"/>
-              </w:rPr>
-              <w:t>Median observed annual convergence rate vs adjusted CDC; 13% per year</w:t>
+              <w:t>Decay rate 0.900; Median observed annual convergence rate vs CDC; 10% per year</w:t>
             </w:r>
           </w:p>
         </w:tc>
@@ -15543,7 +15409,7 @@
                 <w:sz w:val="20"/>
                 <w:szCs w:val="20"/>
               </w:rPr>
-              <w:t>At decay 0.871, most individuals converge to population within 15-20 years</w:t>
+              <w:t>At decay 0.900, most individuals converge to population within 15-20 years</w:t>
             </w:r>
           </w:p>
         </w:tc>
@@ -15656,7 +15522,7 @@
         <w:spacing w:after="120"/>
       </w:pPr>
       <w:r>
-        <w:t>Constant decay assumption: The 0.871 decay rate may not hold uniformly. Chronic conditions (CHF) may have persistent mortality elevation; acute events (recent stroke) may converge faster. Future work could estimate condition-specific decay rates.</w:t>
+        <w:t>Constant decay assumption: The 0.900 decay rate may not hold uniformly. Chronic conditions (CHF) may have persistent mortality elevation; acute events (recent stroke) may converge faster. Future work could estimate condition-specific decay rates.</w:t>
       </w:r>
     </w:p>
     <w:p>
@@ -16005,7 +15871,7 @@
                 <w:sz w:val="20"/>
                 <w:szCs w:val="20"/>
               </w:rPr>
-              <w:t>14 pipeline scripts + Phase 1 archive</w:t>
+              <w:t>13 pipeline scripts + experimental archive</w:t>
             </w:r>
           </w:p>
         </w:tc>
@@ -16832,7 +16698,7 @@
                 <w:sz w:val="20"/>
                 <w:szCs w:val="20"/>
               </w:rPr>
-              <w:t>adjusted_cdc_life_table.csv</w:t>
+              <w:t>baseline_annual_gam.csv</w:t>
             </w:r>
           </w:p>
         </w:tc>
@@ -16858,7 +16724,7 @@
                 <w:sz w:val="20"/>
                 <w:szCs w:val="20"/>
               </w:rPr>
-              <w:t>202</w:t>
+              <w:t>680</w:t>
             </w:r>
           </w:p>
         </w:tc>
@@ -16884,7 +16750,7 @@
                 <w:sz w:val="20"/>
                 <w:szCs w:val="20"/>
               </w:rPr>
-              <w:t>8</w:t>
+              <w:t>4</w:t>
             </w:r>
           </w:p>
         </w:tc>
@@ -16910,7 +16776,7 @@
                 <w:sz w:val="20"/>
                 <w:szCs w:val="20"/>
               </w:rPr>
-              <w:t>Script 14</w:t>
+              <w:t>Script 04 (experimental)</w:t>
             </w:r>
           </w:p>
         </w:tc>
@@ -17279,7 +17145,7 @@
         <w:spacing w:after="120"/>
       </w:pPr>
       <w:r>
-        <w:t>To reproduce from scratch: python "03 code/00_run_all.py". This runs all 14 steps sequentially, smart-skipping downloads if outputs exist. Total runtime is approximately 15–20 minutes on a modern machine (dominated by model training in script 05).</w:t>
+        <w:t>To reproduce from scratch: python "03 code/00_run_all.py". This runs all 13 steps sequentially, smart-skipping downloads if outputs exist. Total runtime is approximately 15–20 minutes on a modern machine (dominated by model training in script 05).</w:t>
       </w:r>
     </w:p>
     <w:p>
@@ -17303,10 +17169,10 @@
 <file path=word/numbering.xml><?xml version="1.0" encoding="utf-8"?>
 <w:numbering xmlns:wpc="http://schemas.microsoft.com/office/word/2010/wordprocessingCanvas" xmlns:cx="http://schemas.microsoft.com/office/drawing/2014/chartex" xmlns:cx1="http://schemas.microsoft.com/office/drawing/2015/9/8/chartex" xmlns:cx2="http://schemas.microsoft.com/office/drawing/2015/10/21/chartex" xmlns:cx3="http://schemas.microsoft.com/office/drawing/2016/5/9/chartex" xmlns:cx4="http://schemas.microsoft.com/office/drawing/2016/5/10/chartex" xmlns:cx5="http://schemas.microsoft.com/office/drawing/2016/5/11/chartex" xmlns:cx6="http://schemas.microsoft.com/office/drawing/2016/5/12/chartex" xmlns:cx7="http://schemas.microsoft.com/office/drawing/2016/5/13/chartex" xmlns:cx8="http://schemas.microsoft.com/office/drawing/2016/5/14/chartex" xmlns:mc="http://schemas.openxmlformats.org/markup-compatibility/2006" xmlns:aink="http://schemas.microsoft.com/office/drawing/2016/ink" xmlns:am3d="http://schemas.microsoft.com/office/drawing/2017/model3d" xmlns:o="urn:schemas-microsoft-com:office:office" xmlns:oel="http://schemas.microsoft.com/office/2019/extlst" xmlns:r="http://schemas.openxmlformats.org/officeDocument/2006/relationships" xmlns:m="http://schemas.openxmlformats.org/officeDocument/2006/math" xmlns:v="urn:schemas-microsoft-com:vml" xmlns:wp14="http://schemas.microsoft.com/office/word/2010/wordprocessingDrawing" xmlns:wp="http://schemas.openxmlformats.org/drawingml/2006/wordprocessingDrawing" xmlns:w10="urn:schemas-microsoft-com:office:word" xmlns:w="http://schemas.openxmlformats.org/wordprocessingml/2006/main" xmlns:w14="http://schemas.microsoft.com/office/word/2010/wordml" xmlns:w15="http://schemas.microsoft.com/office/word/2012/wordml" xmlns:w16cex="http://schemas.microsoft.com/office/word/2018/wordml/cex" xmlns:w16cid="http://schemas.microsoft.com/office/word/2016/wordml/cid" xmlns:w16="http://schemas.microsoft.com/office/word/2018/wordml" xmlns:w16du="http://schemas.microsoft.com/office/word/2023/wordml/word16du" xmlns:w16sdtdh="http://schemas.microsoft.com/office/word/2020/wordml/sdtdatahash" xmlns:w16sdtfl="http://schemas.microsoft.com/office/word/2024/wordml/sdtformatlock" xmlns:w16se="http://schemas.microsoft.com/office/word/2015/wordml/symex" xmlns:wpg="http://schemas.microsoft.com/office/word/2010/wordprocessingGroup" xmlns:wpi="http://schemas.microsoft.com/office/word/2010/wordprocessingInk" xmlns:wne="http://schemas.microsoft.com/office/word/2006/wordml" xmlns:wps="http://schemas.microsoft.com/office/word/2010/wordprocessingShape" mc:Ignorable="w14 w15 w16se w16cid w16 w16cex w16sdtdh w16sdtfl w16du wp14">
   <w:abstractNum w:abstractNumId="0" w15:restartNumberingAfterBreak="0">
-    <w:nsid w:val="7A5E3901"/>
+    <w:nsid w:val="10856EBC"/>
     <w:multiLevelType w:val="hybridMultilevel"/>
-    <w:tmpl w:val="DCD09486"/>
-    <w:lvl w:ilvl="0" w:tplc="4E52F50C">
+    <w:tmpl w:val="B67EAAF8"/>
+    <w:lvl w:ilvl="0" w:tplc="6A0AA36E">
       <w:start w:val="1"/>
       <w:numFmt w:val="bullet"/>
       <w:lvlText w:val="●"/>
@@ -17315,7 +17181,7 @@
         <w:ind w:left="720" w:hanging="360"/>
       </w:pPr>
     </w:lvl>
-    <w:lvl w:ilvl="1" w:tplc="949A6A5E">
+    <w:lvl w:ilvl="1" w:tplc="1DC80122">
       <w:start w:val="1"/>
       <w:numFmt w:val="bullet"/>
       <w:lvlText w:val="○"/>
@@ -17324,7 +17190,7 @@
         <w:ind w:left="1440" w:hanging="360"/>
       </w:pPr>
     </w:lvl>
-    <w:lvl w:ilvl="2" w:tplc="2DC8DE38">
+    <w:lvl w:ilvl="2" w:tplc="CDA6FC60">
       <w:start w:val="1"/>
       <w:numFmt w:val="bullet"/>
       <w:lvlText w:val="■"/>
@@ -17333,7 +17199,7 @@
         <w:ind w:left="2160" w:hanging="360"/>
       </w:pPr>
     </w:lvl>
-    <w:lvl w:ilvl="3" w:tplc="B90C7592">
+    <w:lvl w:ilvl="3" w:tplc="A9B063B8">
       <w:start w:val="1"/>
       <w:numFmt w:val="bullet"/>
       <w:lvlText w:val="●"/>
@@ -17342,7 +17208,7 @@
         <w:ind w:left="2880" w:hanging="360"/>
       </w:pPr>
     </w:lvl>
-    <w:lvl w:ilvl="4" w:tplc="F07AF848">
+    <w:lvl w:ilvl="4" w:tplc="F1D8B1B8">
       <w:start w:val="1"/>
       <w:numFmt w:val="bullet"/>
       <w:lvlText w:val="○"/>
@@ -17351,7 +17217,7 @@
         <w:ind w:left="3600" w:hanging="360"/>
       </w:pPr>
     </w:lvl>
-    <w:lvl w:ilvl="5" w:tplc="9E4C3C2C">
+    <w:lvl w:ilvl="5" w:tplc="677EDE18">
       <w:start w:val="1"/>
       <w:numFmt w:val="bullet"/>
       <w:lvlText w:val="■"/>
@@ -17360,7 +17226,7 @@
         <w:ind w:left="4320" w:hanging="360"/>
       </w:pPr>
     </w:lvl>
-    <w:lvl w:ilvl="6" w:tplc="C8388372">
+    <w:lvl w:ilvl="6" w:tplc="B7B071E0">
       <w:start w:val="1"/>
       <w:numFmt w:val="bullet"/>
       <w:lvlText w:val="●"/>
@@ -17369,7 +17235,7 @@
         <w:ind w:left="5040" w:hanging="360"/>
       </w:pPr>
     </w:lvl>
-    <w:lvl w:ilvl="7" w:tplc="0AA84C62">
+    <w:lvl w:ilvl="7" w:tplc="05A4B14C">
       <w:start w:val="1"/>
       <w:numFmt w:val="bullet"/>
       <w:lvlText w:val="●"/>
@@ -17378,7 +17244,7 @@
         <w:ind w:left="5760" w:hanging="360"/>
       </w:pPr>
     </w:lvl>
-    <w:lvl w:ilvl="8" w:tplc="CC322568">
+    <w:lvl w:ilvl="8" w:tplc="5CE4EF48">
       <w:start w:val="1"/>
       <w:numFmt w:val="bullet"/>
       <w:lvlText w:val="●"/>
@@ -17388,7 +17254,7 @@
       </w:pPr>
     </w:lvl>
   </w:abstractNum>
-  <w:num w:numId="1" w16cid:durableId="263659092">
+  <w:num w:numId="1" w16cid:durableId="644044273">
     <w:abstractNumId w:val="0"/>
     <w:lvlOverride w:ilvl="0">
       <w:startOverride w:val="1"/>

</xml_diff>